<commit_message>
Finalize repository link in manuscript
</commit_message>
<xml_diff>
--- a/masking-gap-revised-controlled-masking-q2-ijmlc-compliant.docx
+++ b/masking-gap-revised-controlled-masking-q2-ijmlc-compliant.docx
@@ -5432,7 +5432,7 @@
         <w:keepNext w:val="0"/>
       </w:pPr>
       <w:r>
-        <w:t>Data and code availability. The accompanying reproducibility package contains the canonical notebook cc3_masking_gap_publication_ready.ipynb, the result CSV files, figures, and subgroup_denominators_per_seed.csv. The denominator file records subgroup totals, positive- and negative-label counts, positive-label rates, recall denominators, and no-positive-label indicators for each dataset, group, and seed. The package also records the recall convention and no-positive-case rule, exact mask-generation seeds, model hyperparameters, preprocessing and imputation rules, software and library versions, and instructions for regenerating every table and figure. A permanent repository or journal-supplement link should replace the request-only distribution route before submission.</w:t>
+        <w:t>Data and code availability. The accompanying reproducibility package contains the canonical notebook cc3_masking_gap_publication_ready.ipynb, the result CSV files, figures, and subgroup_denominators_per_seed.csv. The denominator file records subgroup totals, positive- and negative-label counts, positive-label rates, recall denominators, and no-positive-label indicators for each dataset, group, and seed. The package also records the recall convention and no-positive-case rule, exact mask-generation seeds, model hyperparameters, preprocessing and imputation rules, software and library versions, and instructions for regenerating every table and figure. The package is publicly available in the repository identified in the Data Availability statement below.</w:t>
       </w:r>
     </w:p>
     <w:p>
@@ -5482,7 +5482,7 @@
         <w:rPr>
           <w:rFonts w:ascii="Times New Roman" w:hAnsi="Times New Roman"/>
         </w:rPr>
-        <w:t xml:space="preserve"> The benchmark datasets are publicly available from their cited sources. Code, result files, and reproducibility materials are intended for release at: [PUBLIC REPOSITORY URL/DOI TO BE INSERTED].</w:t>
+        <w:t xml:space="preserve"> The benchmark datasets are publicly available from their cited sources. Code, result files, and reproducibility materials are available at: https://github.com/MVamsiKrishna2501050195/FMG-research.</w:t>
       </w:r>
       <w:r>
         <w:t/>

</xml_diff>